<commit_message>
docs: finalize project report and presentation slides with latest UI screenshots
</commit_message>
<xml_diff>
--- a/docs/TaiLieu_DuAn_SmartRent.docx
+++ b/docs/TaiLieu_DuAn_SmartRent.docx
@@ -17065,6 +17065,421 @@
       </w:tr>
     </w:tbl>
     <w:p>
+      <w:pPr>
+        <w:spacing w:after="120"/>
+      </w:pPr>
+    </w:p>
+    <w:p>
+      <w:pPr>
+        <w:spacing w:after="120" w:line="360"/>
+        <w:jc w:val="both"/>
+      </w:pPr>
+      <w:r>
+        <w:rPr>
+          <w:b/>
+          <w:bCs/>
+          <w:sz w:val="26"/>
+          <w:szCs w:val="26"/>
+          <w:rFonts w:ascii="Times New Roman" w:cs="Times New Roman" w:eastAsia="Times New Roman" w:hAnsi="Times New Roman"/>
+        </w:rPr>
+        <w:t xml:space="preserve">Hình 7.3: Giao diện Trang Tổng quan (Dashboard)</w:t>
+      </w:r>
+    </w:p>
+    <w:p>
+      <w:pPr>
+        <w:spacing w:before="200" w:after="100"/>
+        <w:jc w:val="center"/>
+      </w:pPr>
+      <w:r>
+        <w:drawing>
+          <wp:inline distT="0" distB="0" distL="0" distR="0">
+            <wp:extent cx="5762625" cy="2876550"/>
+            <wp:effectExtent t="0" r="0" b="0" l="0"/>
+            <wp:docPr id="1" name="" descr="" title=""/>
+            <wp:cNvGraphicFramePr>
+              <a:graphicFrameLocks xmlns:a="http://schemas.openxmlformats.org/drawingml/2006/main" noChangeAspect="1"/>
+            </wp:cNvGraphicFramePr>
+            <a:graphic xmlns:a="http://schemas.openxmlformats.org/drawingml/2006/main">
+              <a:graphicData uri="http://schemas.openxmlformats.org/drawingml/2006/picture">
+                <pic:pic xmlns:pic="http://schemas.openxmlformats.org/drawingml/2006/picture">
+                  <pic:nvPicPr>
+                    <pic:cNvPr id="0" name="" descr=""/>
+                    <pic:cNvPicPr>
+                      <a:picLocks noChangeAspect="1" noChangeArrowheads="1"/>
+                    </pic:cNvPicPr>
+                  </pic:nvPicPr>
+                  <pic:blipFill>
+                    <a:blip r:embed="rId9" cstate="none"/>
+                    <a:srcRect/>
+                    <a:stretch>
+                      <a:fillRect/>
+                    </a:stretch>
+                  </pic:blipFill>
+                  <pic:spPr bwMode="auto">
+                    <a:xfrm>
+                      <a:off x="0" y="0"/>
+                      <a:ext cx="5762625" cy="2876550"/>
+                    </a:xfrm>
+                    <a:prstGeom prst="rect">
+                      <a:avLst/>
+                    </a:prstGeom>
+                  </pic:spPr>
+                </pic:pic>
+              </a:graphicData>
+            </a:graphic>
+          </wp:inline>
+        </w:drawing>
+      </w:r>
+    </w:p>
+    <w:p>
+      <w:pPr>
+        <w:spacing w:after="200"/>
+        <w:jc w:val="center"/>
+      </w:pPr>
+      <w:r>
+        <w:rPr>
+          <w:i/>
+          <w:iCs/>
+          <w:sz w:val="22"/>
+          <w:szCs w:val="22"/>
+          <w:rFonts w:ascii="Times New Roman" w:cs="Times New Roman" w:eastAsia="Times New Roman" w:hAnsi="Times New Roman"/>
+        </w:rPr>
+        <w:t xml:space="preserve">Hình 7.3: Dashboard theo dõi tỷ lệ lấp đầy và biểu đồ doanh thu</w:t>
+      </w:r>
+    </w:p>
+    <w:p>
+      <w:pPr>
+        <w:spacing w:after="120"/>
+      </w:pPr>
+    </w:p>
+    <w:p>
+      <w:pPr>
+        <w:spacing w:after="120" w:line="360"/>
+        <w:jc w:val="both"/>
+      </w:pPr>
+      <w:r>
+        <w:rPr>
+          <w:b/>
+          <w:bCs/>
+          <w:sz w:val="26"/>
+          <w:szCs w:val="26"/>
+          <w:rFonts w:ascii="Times New Roman" w:cs="Times New Roman" w:eastAsia="Times New Roman" w:hAnsi="Times New Roman"/>
+        </w:rPr>
+        <w:t xml:space="preserve">Hình 7.4: Giao diện Quản lý Phòng trọ</w:t>
+      </w:r>
+    </w:p>
+    <w:p>
+      <w:pPr>
+        <w:spacing w:before="200" w:after="100"/>
+        <w:jc w:val="center"/>
+      </w:pPr>
+      <w:r>
+        <w:drawing>
+          <wp:inline distT="0" distB="0" distL="0" distR="0">
+            <wp:extent cx="5762625" cy="2876550"/>
+            <wp:effectExtent t="0" r="0" b="0" l="0"/>
+            <wp:docPr id="1" name="" descr="" title=""/>
+            <wp:cNvGraphicFramePr>
+              <a:graphicFrameLocks xmlns:a="http://schemas.openxmlformats.org/drawingml/2006/main" noChangeAspect="1"/>
+            </wp:cNvGraphicFramePr>
+            <a:graphic xmlns:a="http://schemas.openxmlformats.org/drawingml/2006/main">
+              <a:graphicData uri="http://schemas.openxmlformats.org/drawingml/2006/picture">
+                <pic:pic xmlns:pic="http://schemas.openxmlformats.org/drawingml/2006/picture">
+                  <pic:nvPicPr>
+                    <pic:cNvPr id="0" name="" descr=""/>
+                    <pic:cNvPicPr>
+                      <a:picLocks noChangeAspect="1" noChangeArrowheads="1"/>
+                    </pic:cNvPicPr>
+                  </pic:nvPicPr>
+                  <pic:blipFill>
+                    <a:blip r:embed="rId10" cstate="none"/>
+                    <a:srcRect/>
+                    <a:stretch>
+                      <a:fillRect/>
+                    </a:stretch>
+                  </pic:blipFill>
+                  <pic:spPr bwMode="auto">
+                    <a:xfrm>
+                      <a:off x="0" y="0"/>
+                      <a:ext cx="5762625" cy="2876550"/>
+                    </a:xfrm>
+                    <a:prstGeom prst="rect">
+                      <a:avLst/>
+                    </a:prstGeom>
+                  </pic:spPr>
+                </pic:pic>
+              </a:graphicData>
+            </a:graphic>
+          </wp:inline>
+        </w:drawing>
+      </w:r>
+    </w:p>
+    <w:p>
+      <w:pPr>
+        <w:spacing w:after="200"/>
+        <w:jc w:val="center"/>
+      </w:pPr>
+      <w:r>
+        <w:rPr>
+          <w:i/>
+          <w:iCs/>
+          <w:sz w:val="22"/>
+          <w:szCs w:val="22"/>
+          <w:rFonts w:ascii="Times New Roman" w:cs="Times New Roman" w:eastAsia="Times New Roman" w:hAnsi="Times New Roman"/>
+        </w:rPr>
+        <w:t xml:space="preserve">Hình 7.4: Danh sách các phòng trọ và thao tác quản lý</w:t>
+      </w:r>
+    </w:p>
+    <w:p>
+      <w:pPr>
+        <w:spacing w:after="120"/>
+      </w:pPr>
+    </w:p>
+    <w:p>
+      <w:pPr>
+        <w:spacing w:after="120" w:line="360"/>
+        <w:jc w:val="both"/>
+      </w:pPr>
+      <w:r>
+        <w:rPr>
+          <w:b/>
+          <w:bCs/>
+          <w:sz w:val="26"/>
+          <w:szCs w:val="26"/>
+          <w:rFonts w:ascii="Times New Roman" w:cs="Times New Roman" w:eastAsia="Times New Roman" w:hAnsi="Times New Roman"/>
+        </w:rPr>
+        <w:t xml:space="preserve">Hình 7.5: Giao diện Quản lý Cư dân</w:t>
+      </w:r>
+    </w:p>
+    <w:p>
+      <w:pPr>
+        <w:spacing w:before="200" w:after="100"/>
+        <w:jc w:val="center"/>
+      </w:pPr>
+      <w:r>
+        <w:drawing>
+          <wp:inline distT="0" distB="0" distL="0" distR="0">
+            <wp:extent cx="5762625" cy="2876550"/>
+            <wp:effectExtent t="0" r="0" b="0" l="0"/>
+            <wp:docPr id="1" name="" descr="" title=""/>
+            <wp:cNvGraphicFramePr>
+              <a:graphicFrameLocks xmlns:a="http://schemas.openxmlformats.org/drawingml/2006/main" noChangeAspect="1"/>
+            </wp:cNvGraphicFramePr>
+            <a:graphic xmlns:a="http://schemas.openxmlformats.org/drawingml/2006/main">
+              <a:graphicData uri="http://schemas.openxmlformats.org/drawingml/2006/picture">
+                <pic:pic xmlns:pic="http://schemas.openxmlformats.org/drawingml/2006/picture">
+                  <pic:nvPicPr>
+                    <pic:cNvPr id="0" name="" descr=""/>
+                    <pic:cNvPicPr>
+                      <a:picLocks noChangeAspect="1" noChangeArrowheads="1"/>
+                    </pic:cNvPicPr>
+                  </pic:nvPicPr>
+                  <pic:blipFill>
+                    <a:blip r:embed="rId11" cstate="none"/>
+                    <a:srcRect/>
+                    <a:stretch>
+                      <a:fillRect/>
+                    </a:stretch>
+                  </pic:blipFill>
+                  <pic:spPr bwMode="auto">
+                    <a:xfrm>
+                      <a:off x="0" y="0"/>
+                      <a:ext cx="5762625" cy="2876550"/>
+                    </a:xfrm>
+                    <a:prstGeom prst="rect">
+                      <a:avLst/>
+                    </a:prstGeom>
+                  </pic:spPr>
+                </pic:pic>
+              </a:graphicData>
+            </a:graphic>
+          </wp:inline>
+        </w:drawing>
+      </w:r>
+    </w:p>
+    <w:p>
+      <w:pPr>
+        <w:spacing w:after="200"/>
+        <w:jc w:val="center"/>
+      </w:pPr>
+      <w:r>
+        <w:rPr>
+          <w:i/>
+          <w:iCs/>
+          <w:sz w:val="22"/>
+          <w:szCs w:val="22"/>
+          <w:rFonts w:ascii="Times New Roman" w:cs="Times New Roman" w:eastAsia="Times New Roman" w:hAnsi="Times New Roman"/>
+        </w:rPr>
+        <w:t xml:space="preserve">Hình 7.5: Danh sách cư dân đang thuê trọ</w:t>
+      </w:r>
+    </w:p>
+    <w:p>
+      <w:pPr>
+        <w:spacing w:after="120"/>
+      </w:pPr>
+    </w:p>
+    <w:p>
+      <w:pPr>
+        <w:spacing w:after="120" w:line="360"/>
+        <w:jc w:val="both"/>
+      </w:pPr>
+      <w:r>
+        <w:rPr>
+          <w:b/>
+          <w:bCs/>
+          <w:sz w:val="26"/>
+          <w:szCs w:val="26"/>
+          <w:rFonts w:ascii="Times New Roman" w:cs="Times New Roman" w:eastAsia="Times New Roman" w:hAnsi="Times New Roman"/>
+        </w:rPr>
+        <w:t xml:space="preserve">Hình 7.6: Giao diện Quản lý Hợp đồng</w:t>
+      </w:r>
+    </w:p>
+    <w:p>
+      <w:pPr>
+        <w:spacing w:before="200" w:after="100"/>
+        <w:jc w:val="center"/>
+      </w:pPr>
+      <w:r>
+        <w:drawing>
+          <wp:inline distT="0" distB="0" distL="0" distR="0">
+            <wp:extent cx="5762625" cy="2876550"/>
+            <wp:effectExtent t="0" r="0" b="0" l="0"/>
+            <wp:docPr id="1" name="" descr="" title=""/>
+            <wp:cNvGraphicFramePr>
+              <a:graphicFrameLocks xmlns:a="http://schemas.openxmlformats.org/drawingml/2006/main" noChangeAspect="1"/>
+            </wp:cNvGraphicFramePr>
+            <a:graphic xmlns:a="http://schemas.openxmlformats.org/drawingml/2006/main">
+              <a:graphicData uri="http://schemas.openxmlformats.org/drawingml/2006/picture">
+                <pic:pic xmlns:pic="http://schemas.openxmlformats.org/drawingml/2006/picture">
+                  <pic:nvPicPr>
+                    <pic:cNvPr id="0" name="" descr=""/>
+                    <pic:cNvPicPr>
+                      <a:picLocks noChangeAspect="1" noChangeArrowheads="1"/>
+                    </pic:cNvPicPr>
+                  </pic:nvPicPr>
+                  <pic:blipFill>
+                    <a:blip r:embed="rId12" cstate="none"/>
+                    <a:srcRect/>
+                    <a:stretch>
+                      <a:fillRect/>
+                    </a:stretch>
+                  </pic:blipFill>
+                  <pic:spPr bwMode="auto">
+                    <a:xfrm>
+                      <a:off x="0" y="0"/>
+                      <a:ext cx="5762625" cy="2876550"/>
+                    </a:xfrm>
+                    <a:prstGeom prst="rect">
+                      <a:avLst/>
+                    </a:prstGeom>
+                  </pic:spPr>
+                </pic:pic>
+              </a:graphicData>
+            </a:graphic>
+          </wp:inline>
+        </w:drawing>
+      </w:r>
+    </w:p>
+    <w:p>
+      <w:pPr>
+        <w:spacing w:after="200"/>
+        <w:jc w:val="center"/>
+      </w:pPr>
+      <w:r>
+        <w:rPr>
+          <w:i/>
+          <w:iCs/>
+          <w:sz w:val="22"/>
+          <w:szCs w:val="22"/>
+          <w:rFonts w:ascii="Times New Roman" w:cs="Times New Roman" w:eastAsia="Times New Roman" w:hAnsi="Times New Roman"/>
+        </w:rPr>
+        <w:t xml:space="preserve">Hình 7.6: Quản lý trạng thái các hợp đồng thuê</w:t>
+      </w:r>
+    </w:p>
+    <w:p>
+      <w:pPr>
+        <w:spacing w:after="120"/>
+      </w:pPr>
+    </w:p>
+    <w:p>
+      <w:pPr>
+        <w:spacing w:after="120" w:line="360"/>
+        <w:jc w:val="both"/>
+      </w:pPr>
+      <w:r>
+        <w:rPr>
+          <w:b/>
+          <w:bCs/>
+          <w:sz w:val="26"/>
+          <w:szCs w:val="26"/>
+          <w:rFonts w:ascii="Times New Roman" w:cs="Times New Roman" w:eastAsia="Times New Roman" w:hAnsi="Times New Roman"/>
+        </w:rPr>
+        <w:t xml:space="preserve">Hình 7.7: Giao diện Quản lý Hóa đơn</w:t>
+      </w:r>
+    </w:p>
+    <w:p>
+      <w:pPr>
+        <w:spacing w:before="200" w:after="100"/>
+        <w:jc w:val="center"/>
+      </w:pPr>
+      <w:r>
+        <w:drawing>
+          <wp:inline distT="0" distB="0" distL="0" distR="0">
+            <wp:extent cx="5762625" cy="2876550"/>
+            <wp:effectExtent t="0" r="0" b="0" l="0"/>
+            <wp:docPr id="1" name="" descr="" title=""/>
+            <wp:cNvGraphicFramePr>
+              <a:graphicFrameLocks xmlns:a="http://schemas.openxmlformats.org/drawingml/2006/main" noChangeAspect="1"/>
+            </wp:cNvGraphicFramePr>
+            <a:graphic xmlns:a="http://schemas.openxmlformats.org/drawingml/2006/main">
+              <a:graphicData uri="http://schemas.openxmlformats.org/drawingml/2006/picture">
+                <pic:pic xmlns:pic="http://schemas.openxmlformats.org/drawingml/2006/picture">
+                  <pic:nvPicPr>
+                    <pic:cNvPr id="0" name="" descr=""/>
+                    <pic:cNvPicPr>
+                      <a:picLocks noChangeAspect="1" noChangeArrowheads="1"/>
+                    </pic:cNvPicPr>
+                  </pic:nvPicPr>
+                  <pic:blipFill>
+                    <a:blip r:embed="rId13" cstate="none"/>
+                    <a:srcRect/>
+                    <a:stretch>
+                      <a:fillRect/>
+                    </a:stretch>
+                  </pic:blipFill>
+                  <pic:spPr bwMode="auto">
+                    <a:xfrm>
+                      <a:off x="0" y="0"/>
+                      <a:ext cx="5762625" cy="2876550"/>
+                    </a:xfrm>
+                    <a:prstGeom prst="rect">
+                      <a:avLst/>
+                    </a:prstGeom>
+                  </pic:spPr>
+                </pic:pic>
+              </a:graphicData>
+            </a:graphic>
+          </wp:inline>
+        </w:drawing>
+      </w:r>
+    </w:p>
+    <w:p>
+      <w:pPr>
+        <w:spacing w:after="200"/>
+        <w:jc w:val="center"/>
+      </w:pPr>
+      <w:r>
+        <w:rPr>
+          <w:i/>
+          <w:iCs/>
+          <w:sz w:val="22"/>
+          <w:szCs w:val="22"/>
+          <w:rFonts w:ascii="Times New Roman" w:cs="Times New Roman" w:eastAsia="Times New Roman" w:hAnsi="Times New Roman"/>
+        </w:rPr>
+        <w:t xml:space="preserve">Hình 7.7: Theo dõi trạng thái thu chi hóa đơn dịch vụ hàng tháng</w:t>
+      </w:r>
+    </w:p>
+    <w:p>
       <w:r>
         <w:br w:type="page"/>
       </w:r>
@@ -17765,7 +18180,7 @@
                     </pic:cNvPicPr>
                   </pic:nvPicPr>
                   <pic:blipFill>
-                    <a:blip r:embed="rId9" cstate="none"/>
+                    <a:blip r:embed="rId14" cstate="none"/>
                     <a:srcRect/>
                     <a:stretch>
                       <a:fillRect/>

</xml_diff>